<commit_message>
Expand linked structures report
</commit_message>
<xml_diff>
--- a/linked-structures-c/Якумова_ПМ23-3_Пояснительная_записка_списочные_структуры.docx
+++ b/linked-structures-c/Якумова_ПМ23-3_Пояснительная_записка_списочные_структуры.docx
@@ -1934,6 +1934,2000 @@
         <w:t>Полученный результат соответствует целям учебного проекта и может быть использован как законченный учебный пример, а также как база для дальнейшего расширения библиотеки списочных структур данных.</w:t>
       </w:r>
     </w:p>
+    <w:p>
+      <w:r>
+        <w:br w:type="page"/>
+      </w:r>
+    </w:p>
+    <w:p>
+      <w:pPr>
+        <w:spacing w:before="240" w:after="120" w:line="360" w:lineRule="auto"/>
+        <w:jc w:val="center"/>
+      </w:pPr>
+      <w:r>
+        <w:rPr>
+          <w:rFonts w:ascii="Times New Roman" w:hAnsi="Times New Roman"/>
+          <w:b/>
+          <w:sz w:val="28"/>
+        </w:rPr>
+        <w:t>ПРИЛОЖЕНИЕ А. ФУНКЦИИ БИБЛИОТЕКИ И БЛОКИ КОДА</w:t>
+      </w:r>
+    </w:p>
+    <w:p>
+      <w:pPr>
+        <w:spacing w:line="360" w:lineRule="auto" w:after="120"/>
+        <w:ind w:firstLine="709"/>
+      </w:pPr>
+      <w:r>
+        <w:rPr>
+          <w:rFonts w:ascii="Times New Roman" w:hAnsi="Times New Roman"/>
+          <w:b w:val="0"/>
+          <w:sz w:val="28"/>
+        </w:rPr>
+        <w:t>В данном приложении приведены структуры данных и все функции, реализованные в библиотеке списочных структур. Для каждой функции указано назначение, прототип и соответствующий блок кода.</w:t>
+      </w:r>
+    </w:p>
+    <w:p>
+      <w:pPr>
+        <w:spacing w:before="160" w:after="120" w:line="360" w:lineRule="auto"/>
+        <w:jc w:val="left"/>
+      </w:pPr>
+      <w:r>
+        <w:rPr>
+          <w:rFonts w:ascii="Times New Roman" w:hAnsi="Times New Roman"/>
+          <w:b/>
+          <w:sz w:val="28"/>
+        </w:rPr>
+        <w:t>А.1 Структуры данных Node и DoublyLinkedList</w:t>
+      </w:r>
+    </w:p>
+    <w:p>
+      <w:pPr>
+        <w:spacing w:line="360" w:lineRule="auto" w:after="120"/>
+        <w:ind w:firstLine="709"/>
+      </w:pPr>
+      <w:r>
+        <w:rPr>
+          <w:rFonts w:ascii="Times New Roman" w:hAnsi="Times New Roman"/>
+          <w:b w:val="0"/>
+          <w:sz w:val="28"/>
+        </w:rPr>
+        <w:t>Структура Node описывает отдельный узел двунаправленного списка. Структура DoublyLinkedList хранит указатели на начало и конец списка, а также текущее количество элементов.</w:t>
+      </w:r>
+    </w:p>
+    <w:tbl>
+      <w:tblPr>
+        <w:tblW w:type="auto" w:w="0"/>
+        <w:tblLayout w:type="autofit"/>
+        <w:tblLook w:firstColumn="1" w:firstRow="1" w:lastColumn="0" w:lastRow="0" w:noHBand="0" w:noVBand="1" w:val="04A0"/>
+      </w:tblPr>
+      <w:tblGrid>
+        <w:gridCol w:w="9689"/>
+      </w:tblGrid>
+      <w:tr>
+        <w:tc>
+          <w:tcPr>
+            <w:tcW w:type="dxa" w:w="9689"/>
+            <w:shd w:fill="F2F2F2"/>
+          </w:tcPr>
+          <w:p>
+            <w:pPr>
+              <w:spacing w:before="60" w:after="60" w:line="240" w:lineRule="auto"/>
+            </w:pPr>
+            <w:r>
+              <w:rPr>
+                <w:rFonts w:ascii="Courier New" w:hAnsi="Courier New"/>
+                <w:b w:val="0"/>
+                <w:color w:val="000000"/>
+                <w:sz w:val="16"/>
+              </w:rPr>
+              <w:t>typedef struct Node {</w:t>
+              <w:br/>
+              <w:t xml:space="preserve">    int value;</w:t>
+              <w:br/>
+              <w:t xml:space="preserve">    struct Node *prev;</w:t>
+              <w:br/>
+              <w:t xml:space="preserve">    struct Node *next;</w:t>
+              <w:br/>
+              <w:t>} Node;</w:t>
+              <w:br/>
+              <w:br/>
+              <w:t>typedef struct {</w:t>
+              <w:br/>
+              <w:t xml:space="preserve">    Node *head;</w:t>
+              <w:br/>
+              <w:t xml:space="preserve">    Node *tail;</w:t>
+              <w:br/>
+              <w:t xml:space="preserve">    size_t size;</w:t>
+              <w:br/>
+              <w:t>} DoublyLinkedList;</w:t>
+              <w:br/>
+              <w:br/>
+              <w:t>typedef DoublyLinkedList Stack;</w:t>
+              <w:br/>
+              <w:t>typedef DoublyLinkedList Queue;</w:t>
+              <w:br/>
+              <w:t>typedef DoublyLinkedList Deque;</w:t>
+            </w:r>
+          </w:p>
+        </w:tc>
+      </w:tr>
+    </w:tbl>
+    <w:p/>
+    <w:p>
+      <w:pPr>
+        <w:spacing w:before="160" w:after="120" w:line="360" w:lineRule="auto"/>
+        <w:jc w:val="left"/>
+      </w:pPr>
+      <w:r>
+        <w:rPr>
+          <w:rFonts w:ascii="Times New Roman" w:hAnsi="Times New Roman"/>
+          <w:b/>
+          <w:sz w:val="28"/>
+        </w:rPr>
+        <w:t>А.2 Вспомогательная функция node_create</w:t>
+      </w:r>
+    </w:p>
+    <w:p>
+      <w:pPr>
+        <w:spacing w:line="360" w:lineRule="auto" w:after="120"/>
+        <w:ind w:firstLine="709"/>
+      </w:pPr>
+      <w:r>
+        <w:rPr>
+          <w:rFonts w:ascii="Times New Roman" w:hAnsi="Times New Roman"/>
+          <w:b w:val="0"/>
+          <w:sz w:val="28"/>
+        </w:rPr>
+        <w:t>Функция создаёт новый узел списка, записывает в него значение и инициализирует связи prev и next значением NULL. Она объявлена как static, так как используется только внутри файла list.c.</w:t>
+      </w:r>
+    </w:p>
+    <w:tbl>
+      <w:tblPr>
+        <w:tblW w:type="auto" w:w="0"/>
+        <w:tblLayout w:type="autofit"/>
+        <w:tblLook w:firstColumn="1" w:firstRow="1" w:lastColumn="0" w:lastRow="0" w:noHBand="0" w:noVBand="1" w:val="04A0"/>
+      </w:tblPr>
+      <w:tblGrid>
+        <w:gridCol w:w="9689"/>
+      </w:tblGrid>
+      <w:tr>
+        <w:tc>
+          <w:tcPr>
+            <w:tcW w:type="dxa" w:w="9689"/>
+            <w:shd w:fill="F2F2F2"/>
+          </w:tcPr>
+          <w:p>
+            <w:pPr>
+              <w:spacing w:before="60" w:after="60" w:line="240" w:lineRule="auto"/>
+            </w:pPr>
+            <w:r>
+              <w:rPr>
+                <w:rFonts w:ascii="Courier New" w:hAnsi="Courier New"/>
+                <w:b w:val="0"/>
+                <w:color w:val="000000"/>
+                <w:sz w:val="16"/>
+              </w:rPr>
+              <w:t>static Node *node_create(int value) {</w:t>
+              <w:br/>
+              <w:t xml:space="preserve">    Node *node = (Node *)malloc(sizeof(Node));</w:t>
+              <w:br/>
+              <w:t xml:space="preserve">    if (node == NULL) {</w:t>
+              <w:br/>
+              <w:t xml:space="preserve">        return NULL;</w:t>
+              <w:br/>
+              <w:t xml:space="preserve">    }</w:t>
+              <w:br/>
+              <w:br/>
+              <w:t xml:space="preserve">    node-&gt;value = value;</w:t>
+              <w:br/>
+              <w:t xml:space="preserve">    node-&gt;prev = NULL;</w:t>
+              <w:br/>
+              <w:t xml:space="preserve">    node-&gt;next = NULL;</w:t>
+              <w:br/>
+              <w:t xml:space="preserve">    return node;</w:t>
+              <w:br/>
+              <w:t>}</w:t>
+            </w:r>
+          </w:p>
+        </w:tc>
+      </w:tr>
+    </w:tbl>
+    <w:p/>
+    <w:p>
+      <w:pPr>
+        <w:spacing w:before="160" w:after="120" w:line="360" w:lineRule="auto"/>
+        <w:jc w:val="left"/>
+      </w:pPr>
+      <w:r>
+        <w:rPr>
+          <w:rFonts w:ascii="Times New Roman" w:hAnsi="Times New Roman"/>
+          <w:b/>
+          <w:sz w:val="28"/>
+        </w:rPr>
+        <w:t>А.3. Функция list_create</w:t>
+      </w:r>
+    </w:p>
+    <w:p>
+      <w:pPr>
+        <w:spacing w:line="360" w:lineRule="auto" w:after="120"/>
+        <w:ind w:firstLine="709"/>
+      </w:pPr>
+      <w:r>
+        <w:rPr>
+          <w:rFonts w:ascii="Times New Roman" w:hAnsi="Times New Roman"/>
+          <w:b w:val="0"/>
+          <w:sz w:val="28"/>
+        </w:rPr>
+        <w:t>Функция создаёт пустой двунаправленный список и инициализирует поля head, tail и size.</w:t>
+      </w:r>
+    </w:p>
+    <w:p>
+      <w:pPr>
+        <w:spacing w:line="360" w:lineRule="auto" w:after="120"/>
+      </w:pPr>
+      <w:r>
+        <w:rPr>
+          <w:rFonts w:ascii="Times New Roman" w:hAnsi="Times New Roman"/>
+          <w:b w:val="0"/>
+          <w:sz w:val="28"/>
+        </w:rPr>
+        <w:t>Прототип функции: DoublyLinkedList *list_create(void);</w:t>
+      </w:r>
+    </w:p>
+    <w:p>
+      <w:pPr>
+        <w:spacing w:line="360" w:lineRule="auto" w:after="120"/>
+      </w:pPr>
+      <w:r>
+        <w:rPr>
+          <w:rFonts w:ascii="Times New Roman" w:hAnsi="Times New Roman"/>
+          <w:b w:val="0"/>
+          <w:sz w:val="28"/>
+        </w:rPr>
+        <w:t>Блок кода функции:</w:t>
+      </w:r>
+    </w:p>
+    <w:tbl>
+      <w:tblPr>
+        <w:tblW w:type="auto" w:w="0"/>
+        <w:tblLayout w:type="autofit"/>
+        <w:tblLook w:firstColumn="1" w:firstRow="1" w:lastColumn="0" w:lastRow="0" w:noHBand="0" w:noVBand="1" w:val="04A0"/>
+      </w:tblPr>
+      <w:tblGrid>
+        <w:gridCol w:w="9689"/>
+      </w:tblGrid>
+      <w:tr>
+        <w:tc>
+          <w:tcPr>
+            <w:tcW w:type="dxa" w:w="9689"/>
+            <w:shd w:fill="F2F2F2"/>
+          </w:tcPr>
+          <w:p>
+            <w:pPr>
+              <w:spacing w:before="60" w:after="60" w:line="240" w:lineRule="auto"/>
+            </w:pPr>
+            <w:r>
+              <w:rPr>
+                <w:rFonts w:ascii="Courier New" w:hAnsi="Courier New"/>
+                <w:b w:val="0"/>
+                <w:color w:val="000000"/>
+                <w:sz w:val="16"/>
+              </w:rPr>
+              <w:t>DoublyLinkedList *list_create(void) {</w:t>
+              <w:br/>
+              <w:t xml:space="preserve">    DoublyLinkedList *list = (DoublyLinkedList *)malloc(sizeof(DoublyLinkedList));</w:t>
+              <w:br/>
+              <w:t xml:space="preserve">    if (list == NULL) {</w:t>
+              <w:br/>
+              <w:t xml:space="preserve">        return NULL;</w:t>
+              <w:br/>
+              <w:t xml:space="preserve">    }</w:t>
+              <w:br/>
+              <w:br/>
+              <w:t xml:space="preserve">    list-&gt;head = NULL;</w:t>
+              <w:br/>
+              <w:t xml:space="preserve">    list-&gt;tail = NULL;</w:t>
+              <w:br/>
+              <w:t xml:space="preserve">    list-&gt;size = 0;</w:t>
+              <w:br/>
+              <w:t xml:space="preserve">    return list;</w:t>
+              <w:br/>
+              <w:t>}</w:t>
+            </w:r>
+          </w:p>
+        </w:tc>
+      </w:tr>
+    </w:tbl>
+    <w:p/>
+    <w:p>
+      <w:pPr>
+        <w:spacing w:before="160" w:after="120" w:line="360" w:lineRule="auto"/>
+        <w:jc w:val="left"/>
+      </w:pPr>
+      <w:r>
+        <w:rPr>
+          <w:rFonts w:ascii="Times New Roman" w:hAnsi="Times New Roman"/>
+          <w:b/>
+          <w:sz w:val="28"/>
+        </w:rPr>
+        <w:t>А.4. Функция list_free</w:t>
+      </w:r>
+    </w:p>
+    <w:p>
+      <w:pPr>
+        <w:spacing w:line="360" w:lineRule="auto" w:after="120"/>
+        <w:ind w:firstLine="709"/>
+      </w:pPr>
+      <w:r>
+        <w:rPr>
+          <w:rFonts w:ascii="Times New Roman" w:hAnsi="Times New Roman"/>
+          <w:b w:val="0"/>
+          <w:sz w:val="28"/>
+        </w:rPr>
+        <w:t>Функция освобождает все узлы списка и затем освобождает саму управляющую структуру.</w:t>
+      </w:r>
+    </w:p>
+    <w:p>
+      <w:pPr>
+        <w:spacing w:line="360" w:lineRule="auto" w:after="120"/>
+      </w:pPr>
+      <w:r>
+        <w:rPr>
+          <w:rFonts w:ascii="Times New Roman" w:hAnsi="Times New Roman"/>
+          <w:b w:val="0"/>
+          <w:sz w:val="28"/>
+        </w:rPr>
+        <w:t>Прототип функции: void list_free(DoublyLinkedList *list);</w:t>
+      </w:r>
+    </w:p>
+    <w:p>
+      <w:pPr>
+        <w:spacing w:line="360" w:lineRule="auto" w:after="120"/>
+      </w:pPr>
+      <w:r>
+        <w:rPr>
+          <w:rFonts w:ascii="Times New Roman" w:hAnsi="Times New Roman"/>
+          <w:b w:val="0"/>
+          <w:sz w:val="28"/>
+        </w:rPr>
+        <w:t>Блок кода функции:</w:t>
+      </w:r>
+    </w:p>
+    <w:tbl>
+      <w:tblPr>
+        <w:tblW w:type="auto" w:w="0"/>
+        <w:tblLayout w:type="autofit"/>
+        <w:tblLook w:firstColumn="1" w:firstRow="1" w:lastColumn="0" w:lastRow="0" w:noHBand="0" w:noVBand="1" w:val="04A0"/>
+      </w:tblPr>
+      <w:tblGrid>
+        <w:gridCol w:w="9689"/>
+      </w:tblGrid>
+      <w:tr>
+        <w:tc>
+          <w:tcPr>
+            <w:tcW w:type="dxa" w:w="9689"/>
+            <w:shd w:fill="F2F2F2"/>
+          </w:tcPr>
+          <w:p>
+            <w:pPr>
+              <w:spacing w:before="60" w:after="60" w:line="240" w:lineRule="auto"/>
+            </w:pPr>
+            <w:r>
+              <w:rPr>
+                <w:rFonts w:ascii="Courier New" w:hAnsi="Courier New"/>
+                <w:b w:val="0"/>
+                <w:color w:val="000000"/>
+                <w:sz w:val="16"/>
+              </w:rPr>
+              <w:t>void list_free(DoublyLinkedList *list) {</w:t>
+              <w:br/>
+              <w:t xml:space="preserve">    if (list == NULL) {</w:t>
+              <w:br/>
+              <w:t xml:space="preserve">        return;</w:t>
+              <w:br/>
+              <w:t xml:space="preserve">    }</w:t>
+              <w:br/>
+              <w:br/>
+              <w:t xml:space="preserve">    Node *current = list-&gt;head;</w:t>
+              <w:br/>
+              <w:t xml:space="preserve">    while (current != NULL) {</w:t>
+              <w:br/>
+              <w:t xml:space="preserve">        Node *next = current-&gt;next;</w:t>
+              <w:br/>
+              <w:t xml:space="preserve">        free(current);</w:t>
+              <w:br/>
+              <w:t xml:space="preserve">        current = next;</w:t>
+              <w:br/>
+              <w:t xml:space="preserve">    }</w:t>
+              <w:br/>
+              <w:br/>
+              <w:t xml:space="preserve">    free(list);</w:t>
+              <w:br/>
+              <w:t>}</w:t>
+            </w:r>
+          </w:p>
+        </w:tc>
+      </w:tr>
+    </w:tbl>
+    <w:p/>
+    <w:p>
+      <w:pPr>
+        <w:spacing w:before="160" w:after="120" w:line="360" w:lineRule="auto"/>
+        <w:jc w:val="left"/>
+      </w:pPr>
+      <w:r>
+        <w:rPr>
+          <w:rFonts w:ascii="Times New Roman" w:hAnsi="Times New Roman"/>
+          <w:b/>
+          <w:sz w:val="28"/>
+        </w:rPr>
+        <w:t>А.5. Функция list_push_front</w:t>
+      </w:r>
+    </w:p>
+    <w:p>
+      <w:pPr>
+        <w:spacing w:line="360" w:lineRule="auto" w:after="120"/>
+        <w:ind w:firstLine="709"/>
+      </w:pPr>
+      <w:r>
+        <w:rPr>
+          <w:rFonts w:ascii="Times New Roman" w:hAnsi="Times New Roman"/>
+          <w:b w:val="0"/>
+          <w:sz w:val="28"/>
+        </w:rPr>
+        <w:t>Функция добавляет новый элемент в начало двунаправленного списка.</w:t>
+      </w:r>
+    </w:p>
+    <w:p>
+      <w:pPr>
+        <w:spacing w:line="360" w:lineRule="auto" w:after="120"/>
+      </w:pPr>
+      <w:r>
+        <w:rPr>
+          <w:rFonts w:ascii="Times New Roman" w:hAnsi="Times New Roman"/>
+          <w:b w:val="0"/>
+          <w:sz w:val="28"/>
+        </w:rPr>
+        <w:t>Прототип функции: int list_push_front(DoublyLinkedList *list, int value);</w:t>
+      </w:r>
+    </w:p>
+    <w:p>
+      <w:pPr>
+        <w:spacing w:line="360" w:lineRule="auto" w:after="120"/>
+      </w:pPr>
+      <w:r>
+        <w:rPr>
+          <w:rFonts w:ascii="Times New Roman" w:hAnsi="Times New Roman"/>
+          <w:b w:val="0"/>
+          <w:sz w:val="28"/>
+        </w:rPr>
+        <w:t>Блок кода функции:</w:t>
+      </w:r>
+    </w:p>
+    <w:tbl>
+      <w:tblPr>
+        <w:tblW w:type="auto" w:w="0"/>
+        <w:tblLayout w:type="autofit"/>
+        <w:tblLook w:firstColumn="1" w:firstRow="1" w:lastColumn="0" w:lastRow="0" w:noHBand="0" w:noVBand="1" w:val="04A0"/>
+      </w:tblPr>
+      <w:tblGrid>
+        <w:gridCol w:w="9689"/>
+      </w:tblGrid>
+      <w:tr>
+        <w:tc>
+          <w:tcPr>
+            <w:tcW w:type="dxa" w:w="9689"/>
+            <w:shd w:fill="F2F2F2"/>
+          </w:tcPr>
+          <w:p>
+            <w:pPr>
+              <w:spacing w:before="60" w:after="60" w:line="240" w:lineRule="auto"/>
+            </w:pPr>
+            <w:r>
+              <w:rPr>
+                <w:rFonts w:ascii="Courier New" w:hAnsi="Courier New"/>
+                <w:b w:val="0"/>
+                <w:color w:val="000000"/>
+                <w:sz w:val="16"/>
+              </w:rPr>
+              <w:t>int list_push_front(DoublyLinkedList *list, int value) {</w:t>
+              <w:br/>
+              <w:t xml:space="preserve">    if (list == NULL) {</w:t>
+              <w:br/>
+              <w:t xml:space="preserve">        return 0;</w:t>
+              <w:br/>
+              <w:t xml:space="preserve">    }</w:t>
+              <w:br/>
+              <w:br/>
+              <w:t xml:space="preserve">    Node *node = node_create(value);</w:t>
+              <w:br/>
+              <w:t xml:space="preserve">    if (node == NULL) {</w:t>
+              <w:br/>
+              <w:t xml:space="preserve">        return 0;</w:t>
+              <w:br/>
+              <w:t xml:space="preserve">    }</w:t>
+              <w:br/>
+              <w:br/>
+              <w:t xml:space="preserve">    node-&gt;next = list-&gt;head;</w:t>
+              <w:br/>
+              <w:t xml:space="preserve">    if (list-&gt;head != NULL) {</w:t>
+              <w:br/>
+              <w:t xml:space="preserve">        list-&gt;head-&gt;prev = node;</w:t>
+              <w:br/>
+              <w:t xml:space="preserve">    } else {</w:t>
+              <w:br/>
+              <w:t xml:space="preserve">        list-&gt;tail = node;</w:t>
+              <w:br/>
+              <w:t xml:space="preserve">    }</w:t>
+              <w:br/>
+              <w:br/>
+              <w:t xml:space="preserve">    list-&gt;head = node;</w:t>
+              <w:br/>
+              <w:t xml:space="preserve">    list-&gt;size++;</w:t>
+              <w:br/>
+              <w:t xml:space="preserve">    return 1;</w:t>
+              <w:br/>
+              <w:t>}</w:t>
+            </w:r>
+          </w:p>
+        </w:tc>
+      </w:tr>
+    </w:tbl>
+    <w:p/>
+    <w:p>
+      <w:pPr>
+        <w:spacing w:before="160" w:after="120" w:line="360" w:lineRule="auto"/>
+        <w:jc w:val="left"/>
+      </w:pPr>
+      <w:r>
+        <w:rPr>
+          <w:rFonts w:ascii="Times New Roman" w:hAnsi="Times New Roman"/>
+          <w:b/>
+          <w:sz w:val="28"/>
+        </w:rPr>
+        <w:t>А.6. Функция list_push_back</w:t>
+      </w:r>
+    </w:p>
+    <w:p>
+      <w:pPr>
+        <w:spacing w:line="360" w:lineRule="auto" w:after="120"/>
+        <w:ind w:firstLine="709"/>
+      </w:pPr>
+      <w:r>
+        <w:rPr>
+          <w:rFonts w:ascii="Times New Roman" w:hAnsi="Times New Roman"/>
+          <w:b w:val="0"/>
+          <w:sz w:val="28"/>
+        </w:rPr>
+        <w:t>Функция добавляет новый элемент в конец двунаправленного списка.</w:t>
+      </w:r>
+    </w:p>
+    <w:p>
+      <w:pPr>
+        <w:spacing w:line="360" w:lineRule="auto" w:after="120"/>
+      </w:pPr>
+      <w:r>
+        <w:rPr>
+          <w:rFonts w:ascii="Times New Roman" w:hAnsi="Times New Roman"/>
+          <w:b w:val="0"/>
+          <w:sz w:val="28"/>
+        </w:rPr>
+        <w:t>Прототип функции: int list_push_back(DoublyLinkedList *list, int value);</w:t>
+      </w:r>
+    </w:p>
+    <w:p>
+      <w:pPr>
+        <w:spacing w:line="360" w:lineRule="auto" w:after="120"/>
+      </w:pPr>
+      <w:r>
+        <w:rPr>
+          <w:rFonts w:ascii="Times New Roman" w:hAnsi="Times New Roman"/>
+          <w:b w:val="0"/>
+          <w:sz w:val="28"/>
+        </w:rPr>
+        <w:t>Блок кода функции:</w:t>
+      </w:r>
+    </w:p>
+    <w:tbl>
+      <w:tblPr>
+        <w:tblW w:type="auto" w:w="0"/>
+        <w:tblLayout w:type="autofit"/>
+        <w:tblLook w:firstColumn="1" w:firstRow="1" w:lastColumn="0" w:lastRow="0" w:noHBand="0" w:noVBand="1" w:val="04A0"/>
+      </w:tblPr>
+      <w:tblGrid>
+        <w:gridCol w:w="9689"/>
+      </w:tblGrid>
+      <w:tr>
+        <w:tc>
+          <w:tcPr>
+            <w:tcW w:type="dxa" w:w="9689"/>
+            <w:shd w:fill="F2F2F2"/>
+          </w:tcPr>
+          <w:p>
+            <w:pPr>
+              <w:spacing w:before="60" w:after="60" w:line="240" w:lineRule="auto"/>
+            </w:pPr>
+            <w:r>
+              <w:rPr>
+                <w:rFonts w:ascii="Courier New" w:hAnsi="Courier New"/>
+                <w:b w:val="0"/>
+                <w:color w:val="000000"/>
+                <w:sz w:val="16"/>
+              </w:rPr>
+              <w:t>int list_push_back(DoublyLinkedList *list, int value) {</w:t>
+              <w:br/>
+              <w:t xml:space="preserve">    if (list == NULL) {</w:t>
+              <w:br/>
+              <w:t xml:space="preserve">        return 0;</w:t>
+              <w:br/>
+              <w:t xml:space="preserve">    }</w:t>
+              <w:br/>
+              <w:br/>
+              <w:t xml:space="preserve">    Node *node = node_create(value);</w:t>
+              <w:br/>
+              <w:t xml:space="preserve">    if (node == NULL) {</w:t>
+              <w:br/>
+              <w:t xml:space="preserve">        return 0;</w:t>
+              <w:br/>
+              <w:t xml:space="preserve">    }</w:t>
+              <w:br/>
+              <w:br/>
+              <w:t xml:space="preserve">    node-&gt;prev = list-&gt;tail;</w:t>
+              <w:br/>
+              <w:t xml:space="preserve">    if (list-&gt;tail != NULL) {</w:t>
+              <w:br/>
+              <w:t xml:space="preserve">        list-&gt;tail-&gt;next = node;</w:t>
+              <w:br/>
+              <w:t xml:space="preserve">    } else {</w:t>
+              <w:br/>
+              <w:t xml:space="preserve">        list-&gt;head = node;</w:t>
+              <w:br/>
+              <w:t xml:space="preserve">    }</w:t>
+              <w:br/>
+              <w:br/>
+              <w:t xml:space="preserve">    list-&gt;tail = node;</w:t>
+              <w:br/>
+              <w:t xml:space="preserve">    list-&gt;size++;</w:t>
+              <w:br/>
+              <w:t xml:space="preserve">    return 1;</w:t>
+              <w:br/>
+              <w:t>}</w:t>
+            </w:r>
+          </w:p>
+        </w:tc>
+      </w:tr>
+    </w:tbl>
+    <w:p/>
+    <w:p>
+      <w:pPr>
+        <w:spacing w:before="160" w:after="120" w:line="360" w:lineRule="auto"/>
+        <w:jc w:val="left"/>
+      </w:pPr>
+      <w:r>
+        <w:rPr>
+          <w:rFonts w:ascii="Times New Roman" w:hAnsi="Times New Roman"/>
+          <w:b/>
+          <w:sz w:val="28"/>
+        </w:rPr>
+        <w:t>А.7. Функция list_pop_front</w:t>
+      </w:r>
+    </w:p>
+    <w:p>
+      <w:pPr>
+        <w:spacing w:line="360" w:lineRule="auto" w:after="120"/>
+        <w:ind w:firstLine="709"/>
+      </w:pPr>
+      <w:r>
+        <w:rPr>
+          <w:rFonts w:ascii="Times New Roman" w:hAnsi="Times New Roman"/>
+          <w:b w:val="0"/>
+          <w:sz w:val="28"/>
+        </w:rPr>
+        <w:t>Функция извлекает и удаляет первый элемент списка, при необходимости возвращая его значение через указатель.</w:t>
+      </w:r>
+    </w:p>
+    <w:p>
+      <w:pPr>
+        <w:spacing w:line="360" w:lineRule="auto" w:after="120"/>
+      </w:pPr>
+      <w:r>
+        <w:rPr>
+          <w:rFonts w:ascii="Times New Roman" w:hAnsi="Times New Roman"/>
+          <w:b w:val="0"/>
+          <w:sz w:val="28"/>
+        </w:rPr>
+        <w:t>Прототип функции: int list_pop_front(DoublyLinkedList *list, int *value);</w:t>
+      </w:r>
+    </w:p>
+    <w:p>
+      <w:pPr>
+        <w:spacing w:line="360" w:lineRule="auto" w:after="120"/>
+      </w:pPr>
+      <w:r>
+        <w:rPr>
+          <w:rFonts w:ascii="Times New Roman" w:hAnsi="Times New Roman"/>
+          <w:b w:val="0"/>
+          <w:sz w:val="28"/>
+        </w:rPr>
+        <w:t>Блок кода функции:</w:t>
+      </w:r>
+    </w:p>
+    <w:tbl>
+      <w:tblPr>
+        <w:tblW w:type="auto" w:w="0"/>
+        <w:tblLayout w:type="autofit"/>
+        <w:tblLook w:firstColumn="1" w:firstRow="1" w:lastColumn="0" w:lastRow="0" w:noHBand="0" w:noVBand="1" w:val="04A0"/>
+      </w:tblPr>
+      <w:tblGrid>
+        <w:gridCol w:w="9689"/>
+      </w:tblGrid>
+      <w:tr>
+        <w:tc>
+          <w:tcPr>
+            <w:tcW w:type="dxa" w:w="9689"/>
+            <w:shd w:fill="F2F2F2"/>
+          </w:tcPr>
+          <w:p>
+            <w:pPr>
+              <w:spacing w:before="60" w:after="60" w:line="240" w:lineRule="auto"/>
+            </w:pPr>
+            <w:r>
+              <w:rPr>
+                <w:rFonts w:ascii="Courier New" w:hAnsi="Courier New"/>
+                <w:b w:val="0"/>
+                <w:color w:val="000000"/>
+                <w:sz w:val="16"/>
+              </w:rPr>
+              <w:t>int list_pop_front(DoublyLinkedList *list, int *value) {</w:t>
+              <w:br/>
+              <w:t xml:space="preserve">    if (list == NULL || list-&gt;head == NULL) {</w:t>
+              <w:br/>
+              <w:t xml:space="preserve">        return 0;</w:t>
+              <w:br/>
+              <w:t xml:space="preserve">    }</w:t>
+              <w:br/>
+              <w:br/>
+              <w:t xml:space="preserve">    Node *node = list-&gt;head;</w:t>
+              <w:br/>
+              <w:t xml:space="preserve">    if (value != NULL) {</w:t>
+              <w:br/>
+              <w:t xml:space="preserve">        *value = node-&gt;value;</w:t>
+              <w:br/>
+              <w:t xml:space="preserve">    }</w:t>
+              <w:br/>
+              <w:br/>
+              <w:t xml:space="preserve">    list-&gt;head = node-&gt;next;</w:t>
+              <w:br/>
+              <w:t xml:space="preserve">    if (list-&gt;head != NULL) {</w:t>
+              <w:br/>
+              <w:t xml:space="preserve">        list-&gt;head-&gt;prev = NULL;</w:t>
+              <w:br/>
+              <w:t xml:space="preserve">    } else {</w:t>
+              <w:br/>
+              <w:t xml:space="preserve">        list-&gt;tail = NULL;</w:t>
+              <w:br/>
+              <w:t xml:space="preserve">    }</w:t>
+              <w:br/>
+              <w:br/>
+              <w:t xml:space="preserve">    free(node);</w:t>
+              <w:br/>
+              <w:t xml:space="preserve">    list-&gt;size--;</w:t>
+              <w:br/>
+              <w:t xml:space="preserve">    return 1;</w:t>
+              <w:br/>
+              <w:t>}</w:t>
+            </w:r>
+          </w:p>
+        </w:tc>
+      </w:tr>
+    </w:tbl>
+    <w:p/>
+    <w:p>
+      <w:pPr>
+        <w:spacing w:before="160" w:after="120" w:line="360" w:lineRule="auto"/>
+        <w:jc w:val="left"/>
+      </w:pPr>
+      <w:r>
+        <w:rPr>
+          <w:rFonts w:ascii="Times New Roman" w:hAnsi="Times New Roman"/>
+          <w:b/>
+          <w:sz w:val="28"/>
+        </w:rPr>
+        <w:t>А.8. Функция list_pop_back</w:t>
+      </w:r>
+    </w:p>
+    <w:p>
+      <w:pPr>
+        <w:spacing w:line="360" w:lineRule="auto" w:after="120"/>
+        <w:ind w:firstLine="709"/>
+      </w:pPr>
+      <w:r>
+        <w:rPr>
+          <w:rFonts w:ascii="Times New Roman" w:hAnsi="Times New Roman"/>
+          <w:b w:val="0"/>
+          <w:sz w:val="28"/>
+        </w:rPr>
+        <w:t>Функция извлекает и удаляет последний элемент списка, при необходимости возвращая его значение через указатель.</w:t>
+      </w:r>
+    </w:p>
+    <w:p>
+      <w:pPr>
+        <w:spacing w:line="360" w:lineRule="auto" w:after="120"/>
+      </w:pPr>
+      <w:r>
+        <w:rPr>
+          <w:rFonts w:ascii="Times New Roman" w:hAnsi="Times New Roman"/>
+          <w:b w:val="0"/>
+          <w:sz w:val="28"/>
+        </w:rPr>
+        <w:t>Прототип функции: int list_pop_back(DoublyLinkedList *list, int *value);</w:t>
+      </w:r>
+    </w:p>
+    <w:p>
+      <w:pPr>
+        <w:spacing w:line="360" w:lineRule="auto" w:after="120"/>
+      </w:pPr>
+      <w:r>
+        <w:rPr>
+          <w:rFonts w:ascii="Times New Roman" w:hAnsi="Times New Roman"/>
+          <w:b w:val="0"/>
+          <w:sz w:val="28"/>
+        </w:rPr>
+        <w:t>Блок кода функции:</w:t>
+      </w:r>
+    </w:p>
+    <w:tbl>
+      <w:tblPr>
+        <w:tblW w:type="auto" w:w="0"/>
+        <w:tblLayout w:type="autofit"/>
+        <w:tblLook w:firstColumn="1" w:firstRow="1" w:lastColumn="0" w:lastRow="0" w:noHBand="0" w:noVBand="1" w:val="04A0"/>
+      </w:tblPr>
+      <w:tblGrid>
+        <w:gridCol w:w="9689"/>
+      </w:tblGrid>
+      <w:tr>
+        <w:tc>
+          <w:tcPr>
+            <w:tcW w:type="dxa" w:w="9689"/>
+            <w:shd w:fill="F2F2F2"/>
+          </w:tcPr>
+          <w:p>
+            <w:pPr>
+              <w:spacing w:before="60" w:after="60" w:line="240" w:lineRule="auto"/>
+            </w:pPr>
+            <w:r>
+              <w:rPr>
+                <w:rFonts w:ascii="Courier New" w:hAnsi="Courier New"/>
+                <w:b w:val="0"/>
+                <w:color w:val="000000"/>
+                <w:sz w:val="16"/>
+              </w:rPr>
+              <w:t>int list_pop_back(DoublyLinkedList *list, int *value) {</w:t>
+              <w:br/>
+              <w:t xml:space="preserve">    if (list == NULL || list-&gt;tail == NULL) {</w:t>
+              <w:br/>
+              <w:t xml:space="preserve">        return 0;</w:t>
+              <w:br/>
+              <w:t xml:space="preserve">    }</w:t>
+              <w:br/>
+              <w:br/>
+              <w:t xml:space="preserve">    Node *node = list-&gt;tail;</w:t>
+              <w:br/>
+              <w:t xml:space="preserve">    if (value != NULL) {</w:t>
+              <w:br/>
+              <w:t xml:space="preserve">        *value = node-&gt;value;</w:t>
+              <w:br/>
+              <w:t xml:space="preserve">    }</w:t>
+              <w:br/>
+              <w:br/>
+              <w:t xml:space="preserve">    list-&gt;tail = node-&gt;prev;</w:t>
+              <w:br/>
+              <w:t xml:space="preserve">    if (list-&gt;tail != NULL) {</w:t>
+              <w:br/>
+              <w:t xml:space="preserve">        list-&gt;tail-&gt;next = NULL;</w:t>
+              <w:br/>
+              <w:t xml:space="preserve">    } else {</w:t>
+              <w:br/>
+              <w:t xml:space="preserve">        list-&gt;head = NULL;</w:t>
+              <w:br/>
+              <w:t xml:space="preserve">    }</w:t>
+              <w:br/>
+              <w:br/>
+              <w:t xml:space="preserve">    free(node);</w:t>
+              <w:br/>
+              <w:t xml:space="preserve">    list-&gt;size--;</w:t>
+              <w:br/>
+              <w:t xml:space="preserve">    return 1;</w:t>
+              <w:br/>
+              <w:t>}</w:t>
+            </w:r>
+          </w:p>
+        </w:tc>
+      </w:tr>
+    </w:tbl>
+    <w:p/>
+    <w:p>
+      <w:pPr>
+        <w:spacing w:before="160" w:after="120" w:line="360" w:lineRule="auto"/>
+        <w:jc w:val="left"/>
+      </w:pPr>
+      <w:r>
+        <w:rPr>
+          <w:rFonts w:ascii="Times New Roman" w:hAnsi="Times New Roman"/>
+          <w:b/>
+          <w:sz w:val="28"/>
+        </w:rPr>
+        <w:t>А.9. Функция list_find</w:t>
+      </w:r>
+    </w:p>
+    <w:p>
+      <w:pPr>
+        <w:spacing w:line="360" w:lineRule="auto" w:after="120"/>
+        <w:ind w:firstLine="709"/>
+      </w:pPr>
+      <w:r>
+        <w:rPr>
+          <w:rFonts w:ascii="Times New Roman" w:hAnsi="Times New Roman"/>
+          <w:b w:val="0"/>
+          <w:sz w:val="28"/>
+        </w:rPr>
+        <w:t>Функция выполняет последовательный поиск первого узла с заданным значением.</w:t>
+      </w:r>
+    </w:p>
+    <w:p>
+      <w:pPr>
+        <w:spacing w:line="360" w:lineRule="auto" w:after="120"/>
+      </w:pPr>
+      <w:r>
+        <w:rPr>
+          <w:rFonts w:ascii="Times New Roman" w:hAnsi="Times New Roman"/>
+          <w:b w:val="0"/>
+          <w:sz w:val="28"/>
+        </w:rPr>
+        <w:t>Прототип функции: Node *list_find(DoublyLinkedList *list, int value);</w:t>
+      </w:r>
+    </w:p>
+    <w:p>
+      <w:pPr>
+        <w:spacing w:line="360" w:lineRule="auto" w:after="120"/>
+      </w:pPr>
+      <w:r>
+        <w:rPr>
+          <w:rFonts w:ascii="Times New Roman" w:hAnsi="Times New Roman"/>
+          <w:b w:val="0"/>
+          <w:sz w:val="28"/>
+        </w:rPr>
+        <w:t>Блок кода функции:</w:t>
+      </w:r>
+    </w:p>
+    <w:tbl>
+      <w:tblPr>
+        <w:tblW w:type="auto" w:w="0"/>
+        <w:tblLayout w:type="autofit"/>
+        <w:tblLook w:firstColumn="1" w:firstRow="1" w:lastColumn="0" w:lastRow="0" w:noHBand="0" w:noVBand="1" w:val="04A0"/>
+      </w:tblPr>
+      <w:tblGrid>
+        <w:gridCol w:w="9689"/>
+      </w:tblGrid>
+      <w:tr>
+        <w:tc>
+          <w:tcPr>
+            <w:tcW w:type="dxa" w:w="9689"/>
+            <w:shd w:fill="F2F2F2"/>
+          </w:tcPr>
+          <w:p>
+            <w:pPr>
+              <w:spacing w:before="60" w:after="60" w:line="240" w:lineRule="auto"/>
+            </w:pPr>
+            <w:r>
+              <w:rPr>
+                <w:rFonts w:ascii="Courier New" w:hAnsi="Courier New"/>
+                <w:b w:val="0"/>
+                <w:color w:val="000000"/>
+                <w:sz w:val="16"/>
+              </w:rPr>
+              <w:t>Node *list_find(DoublyLinkedList *list, int value) {</w:t>
+              <w:br/>
+              <w:t xml:space="preserve">    if (list == NULL) {</w:t>
+              <w:br/>
+              <w:t xml:space="preserve">        return NULL;</w:t>
+              <w:br/>
+              <w:t xml:space="preserve">    }</w:t>
+              <w:br/>
+              <w:br/>
+              <w:t xml:space="preserve">    Node *current = list-&gt;head;</w:t>
+              <w:br/>
+              <w:t xml:space="preserve">    while (current != NULL) {</w:t>
+              <w:br/>
+              <w:t xml:space="preserve">        if (current-&gt;value == value) {</w:t>
+              <w:br/>
+              <w:t xml:space="preserve">            return current;</w:t>
+              <w:br/>
+              <w:t xml:space="preserve">        }</w:t>
+              <w:br/>
+              <w:t xml:space="preserve">        current = current-&gt;next;</w:t>
+              <w:br/>
+              <w:t xml:space="preserve">    }</w:t>
+              <w:br/>
+              <w:br/>
+              <w:t xml:space="preserve">    return NULL;</w:t>
+              <w:br/>
+              <w:t>}</w:t>
+            </w:r>
+          </w:p>
+        </w:tc>
+      </w:tr>
+    </w:tbl>
+    <w:p/>
+    <w:p>
+      <w:pPr>
+        <w:spacing w:before="160" w:after="120" w:line="360" w:lineRule="auto"/>
+        <w:jc w:val="left"/>
+      </w:pPr>
+      <w:r>
+        <w:rPr>
+          <w:rFonts w:ascii="Times New Roman" w:hAnsi="Times New Roman"/>
+          <w:b/>
+          <w:sz w:val="28"/>
+        </w:rPr>
+        <w:t>А.10. Функция list_remove</w:t>
+      </w:r>
+    </w:p>
+    <w:p>
+      <w:pPr>
+        <w:spacing w:line="360" w:lineRule="auto" w:after="120"/>
+        <w:ind w:firstLine="709"/>
+      </w:pPr>
+      <w:r>
+        <w:rPr>
+          <w:rFonts w:ascii="Times New Roman" w:hAnsi="Times New Roman"/>
+          <w:b w:val="0"/>
+          <w:sz w:val="28"/>
+        </w:rPr>
+        <w:t>Функция удаляет первый найденный узел с заданным значением и корректно обновляет связи соседних элементов.</w:t>
+      </w:r>
+    </w:p>
+    <w:p>
+      <w:pPr>
+        <w:spacing w:line="360" w:lineRule="auto" w:after="120"/>
+      </w:pPr>
+      <w:r>
+        <w:rPr>
+          <w:rFonts w:ascii="Times New Roman" w:hAnsi="Times New Roman"/>
+          <w:b w:val="0"/>
+          <w:sz w:val="28"/>
+        </w:rPr>
+        <w:t>Прототип функции: int list_remove(DoublyLinkedList *list, int value);</w:t>
+      </w:r>
+    </w:p>
+    <w:p>
+      <w:pPr>
+        <w:spacing w:line="360" w:lineRule="auto" w:after="120"/>
+      </w:pPr>
+      <w:r>
+        <w:rPr>
+          <w:rFonts w:ascii="Times New Roman" w:hAnsi="Times New Roman"/>
+          <w:b w:val="0"/>
+          <w:sz w:val="28"/>
+        </w:rPr>
+        <w:t>Блок кода функции:</w:t>
+      </w:r>
+    </w:p>
+    <w:tbl>
+      <w:tblPr>
+        <w:tblW w:type="auto" w:w="0"/>
+        <w:tblLayout w:type="autofit"/>
+        <w:tblLook w:firstColumn="1" w:firstRow="1" w:lastColumn="0" w:lastRow="0" w:noHBand="0" w:noVBand="1" w:val="04A0"/>
+      </w:tblPr>
+      <w:tblGrid>
+        <w:gridCol w:w="9689"/>
+      </w:tblGrid>
+      <w:tr>
+        <w:tc>
+          <w:tcPr>
+            <w:tcW w:type="dxa" w:w="9689"/>
+            <w:shd w:fill="F2F2F2"/>
+          </w:tcPr>
+          <w:p>
+            <w:pPr>
+              <w:spacing w:before="60" w:after="60" w:line="240" w:lineRule="auto"/>
+            </w:pPr>
+            <w:r>
+              <w:rPr>
+                <w:rFonts w:ascii="Courier New" w:hAnsi="Courier New"/>
+                <w:b w:val="0"/>
+                <w:color w:val="000000"/>
+                <w:sz w:val="16"/>
+              </w:rPr>
+              <w:t>int list_remove(DoublyLinkedList *list, int value) {</w:t>
+              <w:br/>
+              <w:t xml:space="preserve">    Node *node = list_find(list, value);</w:t>
+              <w:br/>
+              <w:t xml:space="preserve">    if (list == NULL || node == NULL) {</w:t>
+              <w:br/>
+              <w:t xml:space="preserve">        return 0;</w:t>
+              <w:br/>
+              <w:t xml:space="preserve">    }</w:t>
+              <w:br/>
+              <w:br/>
+              <w:t xml:space="preserve">    if (node-&gt;prev != NULL) {</w:t>
+              <w:br/>
+              <w:t xml:space="preserve">        node-&gt;prev-&gt;next = node-&gt;next;</w:t>
+              <w:br/>
+              <w:t xml:space="preserve">    } else {</w:t>
+              <w:br/>
+              <w:t xml:space="preserve">        list-&gt;head = node-&gt;next;</w:t>
+              <w:br/>
+              <w:t xml:space="preserve">    }</w:t>
+              <w:br/>
+              <w:br/>
+              <w:t xml:space="preserve">    if (node-&gt;next != NULL) {</w:t>
+              <w:br/>
+              <w:t xml:space="preserve">        node-&gt;next-&gt;prev = node-&gt;prev;</w:t>
+              <w:br/>
+              <w:t xml:space="preserve">    } else {</w:t>
+              <w:br/>
+              <w:t xml:space="preserve">        list-&gt;tail = node-&gt;prev;</w:t>
+              <w:br/>
+              <w:t xml:space="preserve">    }</w:t>
+              <w:br/>
+              <w:br/>
+              <w:t xml:space="preserve">    free(node);</w:t>
+              <w:br/>
+              <w:t xml:space="preserve">    list-&gt;size--;</w:t>
+              <w:br/>
+              <w:t xml:space="preserve">    return 1;</w:t>
+              <w:br/>
+              <w:t>}</w:t>
+            </w:r>
+          </w:p>
+        </w:tc>
+      </w:tr>
+    </w:tbl>
+    <w:p/>
+    <w:p>
+      <w:pPr>
+        <w:spacing w:before="160" w:after="120" w:line="360" w:lineRule="auto"/>
+        <w:jc w:val="left"/>
+      </w:pPr>
+      <w:r>
+        <w:rPr>
+          <w:rFonts w:ascii="Times New Roman" w:hAnsi="Times New Roman"/>
+          <w:b/>
+          <w:sz w:val="28"/>
+        </w:rPr>
+        <w:t>А.11. Функция list_print</w:t>
+      </w:r>
+    </w:p>
+    <w:p>
+      <w:pPr>
+        <w:spacing w:line="360" w:lineRule="auto" w:after="120"/>
+        <w:ind w:firstLine="709"/>
+      </w:pPr>
+      <w:r>
+        <w:rPr>
+          <w:rFonts w:ascii="Times New Roman" w:hAnsi="Times New Roman"/>
+          <w:b w:val="0"/>
+          <w:sz w:val="28"/>
+        </w:rPr>
+        <w:t>Функция выводит элементы списка в прямом порядке.</w:t>
+      </w:r>
+    </w:p>
+    <w:p>
+      <w:pPr>
+        <w:spacing w:line="360" w:lineRule="auto" w:after="120"/>
+      </w:pPr>
+      <w:r>
+        <w:rPr>
+          <w:rFonts w:ascii="Times New Roman" w:hAnsi="Times New Roman"/>
+          <w:b w:val="0"/>
+          <w:sz w:val="28"/>
+        </w:rPr>
+        <w:t>Прототип функции: void list_print(const DoublyLinkedList *list);</w:t>
+      </w:r>
+    </w:p>
+    <w:p>
+      <w:pPr>
+        <w:spacing w:line="360" w:lineRule="auto" w:after="120"/>
+      </w:pPr>
+      <w:r>
+        <w:rPr>
+          <w:rFonts w:ascii="Times New Roman" w:hAnsi="Times New Roman"/>
+          <w:b w:val="0"/>
+          <w:sz w:val="28"/>
+        </w:rPr>
+        <w:t>Блок кода функции:</w:t>
+      </w:r>
+    </w:p>
+    <w:tbl>
+      <w:tblPr>
+        <w:tblW w:type="auto" w:w="0"/>
+        <w:tblLayout w:type="autofit"/>
+        <w:tblLook w:firstColumn="1" w:firstRow="1" w:lastColumn="0" w:lastRow="0" w:noHBand="0" w:noVBand="1" w:val="04A0"/>
+      </w:tblPr>
+      <w:tblGrid>
+        <w:gridCol w:w="9689"/>
+      </w:tblGrid>
+      <w:tr>
+        <w:tc>
+          <w:tcPr>
+            <w:tcW w:type="dxa" w:w="9689"/>
+            <w:shd w:fill="F2F2F2"/>
+          </w:tcPr>
+          <w:p>
+            <w:pPr>
+              <w:spacing w:before="60" w:after="60" w:line="240" w:lineRule="auto"/>
+            </w:pPr>
+            <w:r>
+              <w:rPr>
+                <w:rFonts w:ascii="Courier New" w:hAnsi="Courier New"/>
+                <w:b w:val="0"/>
+                <w:color w:val="000000"/>
+                <w:sz w:val="16"/>
+              </w:rPr>
+              <w:t>void list_print(const DoublyLinkedList *list) {</w:t>
+              <w:br/>
+              <w:t xml:space="preserve">    if (list == NULL) {</w:t>
+              <w:br/>
+              <w:t xml:space="preserve">        printf("[]\n");</w:t>
+              <w:br/>
+              <w:t xml:space="preserve">        return;</w:t>
+              <w:br/>
+              <w:t xml:space="preserve">    }</w:t>
+              <w:br/>
+              <w:br/>
+              <w:t xml:space="preserve">    printf("[");</w:t>
+              <w:br/>
+              <w:t xml:space="preserve">    for (Node *current = list-&gt;head; current != NULL; current = current-&gt;next) {</w:t>
+              <w:br/>
+              <w:t xml:space="preserve">        printf("%d", current-&gt;value);</w:t>
+              <w:br/>
+              <w:t xml:space="preserve">        if (current-&gt;next != NULL) {</w:t>
+              <w:br/>
+              <w:t xml:space="preserve">            printf(", ");</w:t>
+              <w:br/>
+              <w:t xml:space="preserve">        }</w:t>
+              <w:br/>
+              <w:t xml:space="preserve">    }</w:t>
+              <w:br/>
+              <w:t xml:space="preserve">    printf("]\n");</w:t>
+              <w:br/>
+              <w:t>}</w:t>
+            </w:r>
+          </w:p>
+        </w:tc>
+      </w:tr>
+    </w:tbl>
+    <w:p/>
+    <w:p>
+      <w:pPr>
+        <w:spacing w:before="160" w:after="120" w:line="360" w:lineRule="auto"/>
+        <w:jc w:val="left"/>
+      </w:pPr>
+      <w:r>
+        <w:rPr>
+          <w:rFonts w:ascii="Times New Roman" w:hAnsi="Times New Roman"/>
+          <w:b/>
+          <w:sz w:val="28"/>
+        </w:rPr>
+        <w:t>А.12. Функция stack_push</w:t>
+      </w:r>
+    </w:p>
+    <w:p>
+      <w:pPr>
+        <w:spacing w:line="360" w:lineRule="auto" w:after="120"/>
+        <w:ind w:firstLine="709"/>
+      </w:pPr>
+      <w:r>
+        <w:rPr>
+          <w:rFonts w:ascii="Times New Roman" w:hAnsi="Times New Roman"/>
+          <w:b w:val="0"/>
+          <w:sz w:val="28"/>
+        </w:rPr>
+        <w:t>Функция добавляет элемент в стек, используя конец списка как вершину.</w:t>
+      </w:r>
+    </w:p>
+    <w:p>
+      <w:pPr>
+        <w:spacing w:line="360" w:lineRule="auto" w:after="120"/>
+      </w:pPr>
+      <w:r>
+        <w:rPr>
+          <w:rFonts w:ascii="Times New Roman" w:hAnsi="Times New Roman"/>
+          <w:b w:val="0"/>
+          <w:sz w:val="28"/>
+        </w:rPr>
+        <w:t>Прототип функции: int stack_push(Stack *stack, int value);</w:t>
+      </w:r>
+    </w:p>
+    <w:p>
+      <w:pPr>
+        <w:spacing w:line="360" w:lineRule="auto" w:after="120"/>
+      </w:pPr>
+      <w:r>
+        <w:rPr>
+          <w:rFonts w:ascii="Times New Roman" w:hAnsi="Times New Roman"/>
+          <w:b w:val="0"/>
+          <w:sz w:val="28"/>
+        </w:rPr>
+        <w:t>Блок кода функции:</w:t>
+      </w:r>
+    </w:p>
+    <w:tbl>
+      <w:tblPr>
+        <w:tblW w:type="auto" w:w="0"/>
+        <w:tblLayout w:type="autofit"/>
+        <w:tblLook w:firstColumn="1" w:firstRow="1" w:lastColumn="0" w:lastRow="0" w:noHBand="0" w:noVBand="1" w:val="04A0"/>
+      </w:tblPr>
+      <w:tblGrid>
+        <w:gridCol w:w="9689"/>
+      </w:tblGrid>
+      <w:tr>
+        <w:tc>
+          <w:tcPr>
+            <w:tcW w:type="dxa" w:w="9689"/>
+            <w:shd w:fill="F2F2F2"/>
+          </w:tcPr>
+          <w:p>
+            <w:pPr>
+              <w:spacing w:before="60" w:after="60" w:line="240" w:lineRule="auto"/>
+            </w:pPr>
+            <w:r>
+              <w:rPr>
+                <w:rFonts w:ascii="Courier New" w:hAnsi="Courier New"/>
+                <w:b w:val="0"/>
+                <w:color w:val="000000"/>
+                <w:sz w:val="16"/>
+              </w:rPr>
+              <w:t>int stack_push(Stack *stack, int value) {</w:t>
+              <w:br/>
+              <w:t xml:space="preserve">    return list_push_back(stack, value);</w:t>
+              <w:br/>
+              <w:t>}</w:t>
+            </w:r>
+          </w:p>
+        </w:tc>
+      </w:tr>
+    </w:tbl>
+    <w:p/>
+    <w:p>
+      <w:pPr>
+        <w:spacing w:before="160" w:after="120" w:line="360" w:lineRule="auto"/>
+        <w:jc w:val="left"/>
+      </w:pPr>
+      <w:r>
+        <w:rPr>
+          <w:rFonts w:ascii="Times New Roman" w:hAnsi="Times New Roman"/>
+          <w:b/>
+          <w:sz w:val="28"/>
+        </w:rPr>
+        <w:t>А.13. Функция stack_pop</w:t>
+      </w:r>
+    </w:p>
+    <w:p>
+      <w:pPr>
+        <w:spacing w:line="360" w:lineRule="auto" w:after="120"/>
+        <w:ind w:firstLine="709"/>
+      </w:pPr>
+      <w:r>
+        <w:rPr>
+          <w:rFonts w:ascii="Times New Roman" w:hAnsi="Times New Roman"/>
+          <w:b w:val="0"/>
+          <w:sz w:val="28"/>
+        </w:rPr>
+        <w:t>Функция извлекает элемент из стека по принципу LIFO.</w:t>
+      </w:r>
+    </w:p>
+    <w:p>
+      <w:pPr>
+        <w:spacing w:line="360" w:lineRule="auto" w:after="120"/>
+      </w:pPr>
+      <w:r>
+        <w:rPr>
+          <w:rFonts w:ascii="Times New Roman" w:hAnsi="Times New Roman"/>
+          <w:b w:val="0"/>
+          <w:sz w:val="28"/>
+        </w:rPr>
+        <w:t>Прототип функции: int stack_pop(Stack *stack, int *value);</w:t>
+      </w:r>
+    </w:p>
+    <w:p>
+      <w:pPr>
+        <w:spacing w:line="360" w:lineRule="auto" w:after="120"/>
+      </w:pPr>
+      <w:r>
+        <w:rPr>
+          <w:rFonts w:ascii="Times New Roman" w:hAnsi="Times New Roman"/>
+          <w:b w:val="0"/>
+          <w:sz w:val="28"/>
+        </w:rPr>
+        <w:t>Блок кода функции:</w:t>
+      </w:r>
+    </w:p>
+    <w:tbl>
+      <w:tblPr>
+        <w:tblW w:type="auto" w:w="0"/>
+        <w:tblLayout w:type="autofit"/>
+        <w:tblLook w:firstColumn="1" w:firstRow="1" w:lastColumn="0" w:lastRow="0" w:noHBand="0" w:noVBand="1" w:val="04A0"/>
+      </w:tblPr>
+      <w:tblGrid>
+        <w:gridCol w:w="9689"/>
+      </w:tblGrid>
+      <w:tr>
+        <w:tc>
+          <w:tcPr>
+            <w:tcW w:type="dxa" w:w="9689"/>
+            <w:shd w:fill="F2F2F2"/>
+          </w:tcPr>
+          <w:p>
+            <w:pPr>
+              <w:spacing w:before="60" w:after="60" w:line="240" w:lineRule="auto"/>
+            </w:pPr>
+            <w:r>
+              <w:rPr>
+                <w:rFonts w:ascii="Courier New" w:hAnsi="Courier New"/>
+                <w:b w:val="0"/>
+                <w:color w:val="000000"/>
+                <w:sz w:val="16"/>
+              </w:rPr>
+              <w:t>int stack_pop(Stack *stack, int *value) {</w:t>
+              <w:br/>
+              <w:t xml:space="preserve">    return list_pop_back(stack, value);</w:t>
+              <w:br/>
+              <w:t>}</w:t>
+            </w:r>
+          </w:p>
+        </w:tc>
+      </w:tr>
+    </w:tbl>
+    <w:p/>
+    <w:p>
+      <w:pPr>
+        <w:spacing w:before="160" w:after="120" w:line="360" w:lineRule="auto"/>
+        <w:jc w:val="left"/>
+      </w:pPr>
+      <w:r>
+        <w:rPr>
+          <w:rFonts w:ascii="Times New Roman" w:hAnsi="Times New Roman"/>
+          <w:b/>
+          <w:sz w:val="28"/>
+        </w:rPr>
+        <w:t>А.14. Функция queue_enqueue</w:t>
+      </w:r>
+    </w:p>
+    <w:p>
+      <w:pPr>
+        <w:spacing w:line="360" w:lineRule="auto" w:after="120"/>
+        <w:ind w:firstLine="709"/>
+      </w:pPr>
+      <w:r>
+        <w:rPr>
+          <w:rFonts w:ascii="Times New Roman" w:hAnsi="Times New Roman"/>
+          <w:b w:val="0"/>
+          <w:sz w:val="28"/>
+        </w:rPr>
+        <w:t>Функция добавляет элемент в конец очереди.</w:t>
+      </w:r>
+    </w:p>
+    <w:p>
+      <w:pPr>
+        <w:spacing w:line="360" w:lineRule="auto" w:after="120"/>
+      </w:pPr>
+      <w:r>
+        <w:rPr>
+          <w:rFonts w:ascii="Times New Roman" w:hAnsi="Times New Roman"/>
+          <w:b w:val="0"/>
+          <w:sz w:val="28"/>
+        </w:rPr>
+        <w:t>Прототип функции: int queue_enqueue(Queue *queue, int value);</w:t>
+      </w:r>
+    </w:p>
+    <w:p>
+      <w:pPr>
+        <w:spacing w:line="360" w:lineRule="auto" w:after="120"/>
+      </w:pPr>
+      <w:r>
+        <w:rPr>
+          <w:rFonts w:ascii="Times New Roman" w:hAnsi="Times New Roman"/>
+          <w:b w:val="0"/>
+          <w:sz w:val="28"/>
+        </w:rPr>
+        <w:t>Блок кода функции:</w:t>
+      </w:r>
+    </w:p>
+    <w:tbl>
+      <w:tblPr>
+        <w:tblW w:type="auto" w:w="0"/>
+        <w:tblLayout w:type="autofit"/>
+        <w:tblLook w:firstColumn="1" w:firstRow="1" w:lastColumn="0" w:lastRow="0" w:noHBand="0" w:noVBand="1" w:val="04A0"/>
+      </w:tblPr>
+      <w:tblGrid>
+        <w:gridCol w:w="9689"/>
+      </w:tblGrid>
+      <w:tr>
+        <w:tc>
+          <w:tcPr>
+            <w:tcW w:type="dxa" w:w="9689"/>
+            <w:shd w:fill="F2F2F2"/>
+          </w:tcPr>
+          <w:p>
+            <w:pPr>
+              <w:spacing w:before="60" w:after="60" w:line="240" w:lineRule="auto"/>
+            </w:pPr>
+            <w:r>
+              <w:rPr>
+                <w:rFonts w:ascii="Courier New" w:hAnsi="Courier New"/>
+                <w:b w:val="0"/>
+                <w:color w:val="000000"/>
+                <w:sz w:val="16"/>
+              </w:rPr>
+              <w:t>int queue_enqueue(Queue *queue, int value) {</w:t>
+              <w:br/>
+              <w:t xml:space="preserve">    return list_push_back(queue, value);</w:t>
+              <w:br/>
+              <w:t>}</w:t>
+            </w:r>
+          </w:p>
+        </w:tc>
+      </w:tr>
+    </w:tbl>
+    <w:p/>
+    <w:p>
+      <w:pPr>
+        <w:spacing w:before="160" w:after="120" w:line="360" w:lineRule="auto"/>
+        <w:jc w:val="left"/>
+      </w:pPr>
+      <w:r>
+        <w:rPr>
+          <w:rFonts w:ascii="Times New Roman" w:hAnsi="Times New Roman"/>
+          <w:b/>
+          <w:sz w:val="28"/>
+        </w:rPr>
+        <w:t>А.15. Функция queue_dequeue</w:t>
+      </w:r>
+    </w:p>
+    <w:p>
+      <w:pPr>
+        <w:spacing w:line="360" w:lineRule="auto" w:after="120"/>
+        <w:ind w:firstLine="709"/>
+      </w:pPr>
+      <w:r>
+        <w:rPr>
+          <w:rFonts w:ascii="Times New Roman" w:hAnsi="Times New Roman"/>
+          <w:b w:val="0"/>
+          <w:sz w:val="28"/>
+        </w:rPr>
+        <w:t>Функция извлекает элемент из начала очереди по принципу FIFO.</w:t>
+      </w:r>
+    </w:p>
+    <w:p>
+      <w:pPr>
+        <w:spacing w:line="360" w:lineRule="auto" w:after="120"/>
+      </w:pPr>
+      <w:r>
+        <w:rPr>
+          <w:rFonts w:ascii="Times New Roman" w:hAnsi="Times New Roman"/>
+          <w:b w:val="0"/>
+          <w:sz w:val="28"/>
+        </w:rPr>
+        <w:t>Прототип функции: int queue_dequeue(Queue *queue, int *value);</w:t>
+      </w:r>
+    </w:p>
+    <w:p>
+      <w:pPr>
+        <w:spacing w:line="360" w:lineRule="auto" w:after="120"/>
+      </w:pPr>
+      <w:r>
+        <w:rPr>
+          <w:rFonts w:ascii="Times New Roman" w:hAnsi="Times New Roman"/>
+          <w:b w:val="0"/>
+          <w:sz w:val="28"/>
+        </w:rPr>
+        <w:t>Блок кода функции:</w:t>
+      </w:r>
+    </w:p>
+    <w:tbl>
+      <w:tblPr>
+        <w:tblW w:type="auto" w:w="0"/>
+        <w:tblLayout w:type="autofit"/>
+        <w:tblLook w:firstColumn="1" w:firstRow="1" w:lastColumn="0" w:lastRow="0" w:noHBand="0" w:noVBand="1" w:val="04A0"/>
+      </w:tblPr>
+      <w:tblGrid>
+        <w:gridCol w:w="9689"/>
+      </w:tblGrid>
+      <w:tr>
+        <w:tc>
+          <w:tcPr>
+            <w:tcW w:type="dxa" w:w="9689"/>
+            <w:shd w:fill="F2F2F2"/>
+          </w:tcPr>
+          <w:p>
+            <w:pPr>
+              <w:spacing w:before="60" w:after="60" w:line="240" w:lineRule="auto"/>
+            </w:pPr>
+            <w:r>
+              <w:rPr>
+                <w:rFonts w:ascii="Courier New" w:hAnsi="Courier New"/>
+                <w:b w:val="0"/>
+                <w:color w:val="000000"/>
+                <w:sz w:val="16"/>
+              </w:rPr>
+              <w:t>int queue_dequeue(Queue *queue, int *value) {</w:t>
+              <w:br/>
+              <w:t xml:space="preserve">    return list_pop_front(queue, value);</w:t>
+              <w:br/>
+              <w:t>}</w:t>
+            </w:r>
+          </w:p>
+        </w:tc>
+      </w:tr>
+    </w:tbl>
+    <w:p/>
+    <w:p>
+      <w:pPr>
+        <w:spacing w:before="160" w:after="120" w:line="360" w:lineRule="auto"/>
+        <w:jc w:val="left"/>
+      </w:pPr>
+      <w:r>
+        <w:rPr>
+          <w:rFonts w:ascii="Times New Roman" w:hAnsi="Times New Roman"/>
+          <w:b/>
+          <w:sz w:val="28"/>
+        </w:rPr>
+        <w:t>А.16. Функция deque_push_front</w:t>
+      </w:r>
+    </w:p>
+    <w:p>
+      <w:pPr>
+        <w:spacing w:line="360" w:lineRule="auto" w:after="120"/>
+        <w:ind w:firstLine="709"/>
+      </w:pPr>
+      <w:r>
+        <w:rPr>
+          <w:rFonts w:ascii="Times New Roman" w:hAnsi="Times New Roman"/>
+          <w:b w:val="0"/>
+          <w:sz w:val="28"/>
+        </w:rPr>
+        <w:t>Функция добавляет элемент в начало дека.</w:t>
+      </w:r>
+    </w:p>
+    <w:p>
+      <w:pPr>
+        <w:spacing w:line="360" w:lineRule="auto" w:after="120"/>
+      </w:pPr>
+      <w:r>
+        <w:rPr>
+          <w:rFonts w:ascii="Times New Roman" w:hAnsi="Times New Roman"/>
+          <w:b w:val="0"/>
+          <w:sz w:val="28"/>
+        </w:rPr>
+        <w:t>Прототип функции: int deque_push_front(Deque *deque, int value);</w:t>
+      </w:r>
+    </w:p>
+    <w:p>
+      <w:pPr>
+        <w:spacing w:line="360" w:lineRule="auto" w:after="120"/>
+      </w:pPr>
+      <w:r>
+        <w:rPr>
+          <w:rFonts w:ascii="Times New Roman" w:hAnsi="Times New Roman"/>
+          <w:b w:val="0"/>
+          <w:sz w:val="28"/>
+        </w:rPr>
+        <w:t>Блок кода функции:</w:t>
+      </w:r>
+    </w:p>
+    <w:tbl>
+      <w:tblPr>
+        <w:tblW w:type="auto" w:w="0"/>
+        <w:tblLayout w:type="autofit"/>
+        <w:tblLook w:firstColumn="1" w:firstRow="1" w:lastColumn="0" w:lastRow="0" w:noHBand="0" w:noVBand="1" w:val="04A0"/>
+      </w:tblPr>
+      <w:tblGrid>
+        <w:gridCol w:w="9689"/>
+      </w:tblGrid>
+      <w:tr>
+        <w:tc>
+          <w:tcPr>
+            <w:tcW w:type="dxa" w:w="9689"/>
+            <w:shd w:fill="F2F2F2"/>
+          </w:tcPr>
+          <w:p>
+            <w:pPr>
+              <w:spacing w:before="60" w:after="60" w:line="240" w:lineRule="auto"/>
+            </w:pPr>
+            <w:r>
+              <w:rPr>
+                <w:rFonts w:ascii="Courier New" w:hAnsi="Courier New"/>
+                <w:b w:val="0"/>
+                <w:color w:val="000000"/>
+                <w:sz w:val="16"/>
+              </w:rPr>
+              <w:t>int deque_push_front(Deque *deque, int value) {</w:t>
+              <w:br/>
+              <w:t xml:space="preserve">    return list_push_front(deque, value);</w:t>
+              <w:br/>
+              <w:t>}</w:t>
+            </w:r>
+          </w:p>
+        </w:tc>
+      </w:tr>
+    </w:tbl>
+    <w:p/>
+    <w:p>
+      <w:pPr>
+        <w:spacing w:before="160" w:after="120" w:line="360" w:lineRule="auto"/>
+        <w:jc w:val="left"/>
+      </w:pPr>
+      <w:r>
+        <w:rPr>
+          <w:rFonts w:ascii="Times New Roman" w:hAnsi="Times New Roman"/>
+          <w:b/>
+          <w:sz w:val="28"/>
+        </w:rPr>
+        <w:t>А.17. Функция deque_push_back</w:t>
+      </w:r>
+    </w:p>
+    <w:p>
+      <w:pPr>
+        <w:spacing w:line="360" w:lineRule="auto" w:after="120"/>
+        <w:ind w:firstLine="709"/>
+      </w:pPr>
+      <w:r>
+        <w:rPr>
+          <w:rFonts w:ascii="Times New Roman" w:hAnsi="Times New Roman"/>
+          <w:b w:val="0"/>
+          <w:sz w:val="28"/>
+        </w:rPr>
+        <w:t>Функция добавляет элемент в конец дека.</w:t>
+      </w:r>
+    </w:p>
+    <w:p>
+      <w:pPr>
+        <w:spacing w:line="360" w:lineRule="auto" w:after="120"/>
+      </w:pPr>
+      <w:r>
+        <w:rPr>
+          <w:rFonts w:ascii="Times New Roman" w:hAnsi="Times New Roman"/>
+          <w:b w:val="0"/>
+          <w:sz w:val="28"/>
+        </w:rPr>
+        <w:t>Прототип функции: int deque_push_back(Deque *deque, int value);</w:t>
+      </w:r>
+    </w:p>
+    <w:p>
+      <w:pPr>
+        <w:spacing w:line="360" w:lineRule="auto" w:after="120"/>
+      </w:pPr>
+      <w:r>
+        <w:rPr>
+          <w:rFonts w:ascii="Times New Roman" w:hAnsi="Times New Roman"/>
+          <w:b w:val="0"/>
+          <w:sz w:val="28"/>
+        </w:rPr>
+        <w:t>Блок кода функции:</w:t>
+      </w:r>
+    </w:p>
+    <w:tbl>
+      <w:tblPr>
+        <w:tblW w:type="auto" w:w="0"/>
+        <w:tblLayout w:type="autofit"/>
+        <w:tblLook w:firstColumn="1" w:firstRow="1" w:lastColumn="0" w:lastRow="0" w:noHBand="0" w:noVBand="1" w:val="04A0"/>
+      </w:tblPr>
+      <w:tblGrid>
+        <w:gridCol w:w="9689"/>
+      </w:tblGrid>
+      <w:tr>
+        <w:tc>
+          <w:tcPr>
+            <w:tcW w:type="dxa" w:w="9689"/>
+            <w:shd w:fill="F2F2F2"/>
+          </w:tcPr>
+          <w:p>
+            <w:pPr>
+              <w:spacing w:before="60" w:after="60" w:line="240" w:lineRule="auto"/>
+            </w:pPr>
+            <w:r>
+              <w:rPr>
+                <w:rFonts w:ascii="Courier New" w:hAnsi="Courier New"/>
+                <w:b w:val="0"/>
+                <w:color w:val="000000"/>
+                <w:sz w:val="16"/>
+              </w:rPr>
+              <w:t>int deque_push_back(Deque *deque, int value) {</w:t>
+              <w:br/>
+              <w:t xml:space="preserve">    return list_push_back(deque, value);</w:t>
+              <w:br/>
+              <w:t>}</w:t>
+            </w:r>
+          </w:p>
+        </w:tc>
+      </w:tr>
+    </w:tbl>
+    <w:p/>
+    <w:p>
+      <w:pPr>
+        <w:spacing w:before="160" w:after="120" w:line="360" w:lineRule="auto"/>
+        <w:jc w:val="left"/>
+      </w:pPr>
+      <w:r>
+        <w:rPr>
+          <w:rFonts w:ascii="Times New Roman" w:hAnsi="Times New Roman"/>
+          <w:b/>
+          <w:sz w:val="28"/>
+        </w:rPr>
+        <w:t>А.18. Функция deque_pop_front</w:t>
+      </w:r>
+    </w:p>
+    <w:p>
+      <w:pPr>
+        <w:spacing w:line="360" w:lineRule="auto" w:after="120"/>
+        <w:ind w:firstLine="709"/>
+      </w:pPr>
+      <w:r>
+        <w:rPr>
+          <w:rFonts w:ascii="Times New Roman" w:hAnsi="Times New Roman"/>
+          <w:b w:val="0"/>
+          <w:sz w:val="28"/>
+        </w:rPr>
+        <w:t>Функция извлекает элемент из начала дека.</w:t>
+      </w:r>
+    </w:p>
+    <w:p>
+      <w:pPr>
+        <w:spacing w:line="360" w:lineRule="auto" w:after="120"/>
+      </w:pPr>
+      <w:r>
+        <w:rPr>
+          <w:rFonts w:ascii="Times New Roman" w:hAnsi="Times New Roman"/>
+          <w:b w:val="0"/>
+          <w:sz w:val="28"/>
+        </w:rPr>
+        <w:t>Прототип функции: int deque_pop_front(Deque *deque, int *value);</w:t>
+      </w:r>
+    </w:p>
+    <w:p>
+      <w:pPr>
+        <w:spacing w:line="360" w:lineRule="auto" w:after="120"/>
+      </w:pPr>
+      <w:r>
+        <w:rPr>
+          <w:rFonts w:ascii="Times New Roman" w:hAnsi="Times New Roman"/>
+          <w:b w:val="0"/>
+          <w:sz w:val="28"/>
+        </w:rPr>
+        <w:t>Блок кода функции:</w:t>
+      </w:r>
+    </w:p>
+    <w:tbl>
+      <w:tblPr>
+        <w:tblW w:type="auto" w:w="0"/>
+        <w:tblLayout w:type="autofit"/>
+        <w:tblLook w:firstColumn="1" w:firstRow="1" w:lastColumn="0" w:lastRow="0" w:noHBand="0" w:noVBand="1" w:val="04A0"/>
+      </w:tblPr>
+      <w:tblGrid>
+        <w:gridCol w:w="9689"/>
+      </w:tblGrid>
+      <w:tr>
+        <w:tc>
+          <w:tcPr>
+            <w:tcW w:type="dxa" w:w="9689"/>
+            <w:shd w:fill="F2F2F2"/>
+          </w:tcPr>
+          <w:p>
+            <w:pPr>
+              <w:spacing w:before="60" w:after="60" w:line="240" w:lineRule="auto"/>
+            </w:pPr>
+            <w:r>
+              <w:rPr>
+                <w:rFonts w:ascii="Courier New" w:hAnsi="Courier New"/>
+                <w:b w:val="0"/>
+                <w:color w:val="000000"/>
+                <w:sz w:val="16"/>
+              </w:rPr>
+              <w:t>int deque_pop_front(Deque *deque, int *value) {</w:t>
+              <w:br/>
+              <w:t xml:space="preserve">    return list_pop_front(deque, value);</w:t>
+              <w:br/>
+              <w:t>}</w:t>
+            </w:r>
+          </w:p>
+        </w:tc>
+      </w:tr>
+    </w:tbl>
+    <w:p/>
+    <w:p>
+      <w:pPr>
+        <w:spacing w:before="160" w:after="120" w:line="360" w:lineRule="auto"/>
+        <w:jc w:val="left"/>
+      </w:pPr>
+      <w:r>
+        <w:rPr>
+          <w:rFonts w:ascii="Times New Roman" w:hAnsi="Times New Roman"/>
+          <w:b/>
+          <w:sz w:val="28"/>
+        </w:rPr>
+        <w:t>А.19. Функция deque_pop_back</w:t>
+      </w:r>
+    </w:p>
+    <w:p>
+      <w:pPr>
+        <w:spacing w:line="360" w:lineRule="auto" w:after="120"/>
+        <w:ind w:firstLine="709"/>
+      </w:pPr>
+      <w:r>
+        <w:rPr>
+          <w:rFonts w:ascii="Times New Roman" w:hAnsi="Times New Roman"/>
+          <w:b w:val="0"/>
+          <w:sz w:val="28"/>
+        </w:rPr>
+        <w:t>Функция извлекает элемент из конца дека.</w:t>
+      </w:r>
+    </w:p>
+    <w:p>
+      <w:pPr>
+        <w:spacing w:line="360" w:lineRule="auto" w:after="120"/>
+      </w:pPr>
+      <w:r>
+        <w:rPr>
+          <w:rFonts w:ascii="Times New Roman" w:hAnsi="Times New Roman"/>
+          <w:b w:val="0"/>
+          <w:sz w:val="28"/>
+        </w:rPr>
+        <w:t>Прототип функции: int deque_pop_back(Deque *deque, int *value);</w:t>
+      </w:r>
+    </w:p>
+    <w:p>
+      <w:pPr>
+        <w:spacing w:line="360" w:lineRule="auto" w:after="120"/>
+      </w:pPr>
+      <w:r>
+        <w:rPr>
+          <w:rFonts w:ascii="Times New Roman" w:hAnsi="Times New Roman"/>
+          <w:b w:val="0"/>
+          <w:sz w:val="28"/>
+        </w:rPr>
+        <w:t>Блок кода функции:</w:t>
+      </w:r>
+    </w:p>
+    <w:tbl>
+      <w:tblPr>
+        <w:tblW w:type="auto" w:w="0"/>
+        <w:tblLayout w:type="autofit"/>
+        <w:tblLook w:firstColumn="1" w:firstRow="1" w:lastColumn="0" w:lastRow="0" w:noHBand="0" w:noVBand="1" w:val="04A0"/>
+      </w:tblPr>
+      <w:tblGrid>
+        <w:gridCol w:w="9689"/>
+      </w:tblGrid>
+      <w:tr>
+        <w:tc>
+          <w:tcPr>
+            <w:tcW w:type="dxa" w:w="9689"/>
+            <w:shd w:fill="F2F2F2"/>
+          </w:tcPr>
+          <w:p>
+            <w:pPr>
+              <w:spacing w:before="60" w:after="60" w:line="240" w:lineRule="auto"/>
+            </w:pPr>
+            <w:r>
+              <w:rPr>
+                <w:rFonts w:ascii="Courier New" w:hAnsi="Courier New"/>
+                <w:b w:val="0"/>
+                <w:color w:val="000000"/>
+                <w:sz w:val="16"/>
+              </w:rPr>
+              <w:t>int deque_pop_back(Deque *deque, int *value) {</w:t>
+              <w:br/>
+              <w:t xml:space="preserve">    return list_pop_back(deque, value);</w:t>
+              <w:br/>
+              <w:t>}</w:t>
+            </w:r>
+          </w:p>
+        </w:tc>
+      </w:tr>
+    </w:tbl>
+    <w:p/>
     <w:sectPr>
       <w:pgSz w:w="12240" w:h="15840"/>
       <w:pgMar w:top="1134" w:right="850" w:bottom="1134" w:left="1701" w:header="720" w:footer="720" w:gutter="0"/>

</xml_diff>